<commit_message>
Reprice sprint to 18k plus GST and add fractional advisory as ongoing option
Co-Authored-By: Claude Fable 5 <noreply@anthropic.com>
Claude-Session: https://claude.ai/code/session_01PPCVtAbEtcwFeYVLmMaxYT
</commit_message>
<xml_diff>
--- a/section-ai-alignment/word/10 AIPT proposal - DRAFT.docx
+++ b/section-ai-alignment/word/10 AIPT proposal - DRAFT.docx
@@ -19,7 +19,7 @@
       </w:r>
     </w:p>
     <w:bookmarkEnd w:id="20"/>
-    <w:bookmarkStart w:id="30" w:name="X0c3f710a77d991a1b56bb957cc90827aa661fb9"/>
+    <w:bookmarkStart w:id="31" w:name="X0c3f710a77d991a1b56bb957cc90827aa661fb9"/>
     <w:p>
       <w:pPr>
         <w:pStyle w:val="Heading1"/>
@@ -450,7 +450,7 @@
               <w:jc w:val="left"/>
             </w:pPr>
             <w:r>
-              <w:t xml:space="preserve">$15,000 + GST</w:t>
+              <w:t xml:space="preserve">$18,000 + GST</w:t>
             </w:r>
           </w:p>
         </w:tc>
@@ -484,7 +484,7 @@
                 <w:bCs/>
                 <w:b/>
               </w:rPr>
-              <w:t xml:space="preserve">$16,900 + GST</w:t>
+              <w:t xml:space="preserve">$19,900 + GST</w:t>
             </w:r>
           </w:p>
         </w:tc>
@@ -499,7 +499,25 @@
       </w:r>
     </w:p>
     <w:bookmarkEnd w:id="26"/>
-    <w:bookmarkStart w:id="27" w:name="timing"/>
+    <w:bookmarkStart w:id="27" w:name="ongoing-if-you-want-it"/>
+    <w:p>
+      <w:pPr>
+        <w:pStyle w:val="Heading2"/>
+      </w:pPr>
+      <w:r>
+        <w:t xml:space="preserve">Ongoing, if you want it</w:t>
+      </w:r>
+    </w:p>
+    <w:p>
+      <w:pPr>
+        <w:pStyle w:val="FirstParagraph"/>
+      </w:pPr>
+      <w:r>
+        <w:t xml:space="preserve">When the sprint ends, some businesses want steady senior support as the roadmap rolls on: new questions, new tools, the next cohort, and someone at the table when AI decisions come up. That is the Fractional AI Advisor seat: one to two days a week inside the business at $8,500 + GST per month, three-month minimum. I hold two of these seats at a time, so each business gets real attention. No decision needed now; the option is here so you can see the whole path.</w:t>
+      </w:r>
+    </w:p>
+    <w:bookmarkEnd w:id="27"/>
+    <w:bookmarkStart w:id="28" w:name="timing"/>
     <w:p>
       <w:pPr>
         <w:pStyle w:val="Heading2"/>
@@ -544,8 +562,8 @@
         <w:t xml:space="preserve">By roughly week eight, the team is running its own work.</w:t>
       </w:r>
     </w:p>
-    <w:bookmarkEnd w:id="27"/>
-    <w:bookmarkStart w:id="28" w:name="how-i-work"/>
+    <w:bookmarkEnd w:id="28"/>
+    <w:bookmarkStart w:id="29" w:name="how-i-work"/>
     <w:p>
       <w:pPr>
         <w:pStyle w:val="Heading2"/>
@@ -562,8 +580,8 @@
         <w:t xml:space="preserve">Everything in this engagement follows the same rule I’ll help your team adopt: a person owns everything that goes out the door, sensitive data only goes where it has been agreed to go, and anything automated has a named human checking it. The ground rules your leaders draft in part one govern the work we do together from that day on.</w:t>
       </w:r>
     </w:p>
-    <w:bookmarkEnd w:id="28"/>
-    <w:bookmarkStart w:id="29" w:name="next-step"/>
+    <w:bookmarkEnd w:id="29"/>
+    <w:bookmarkStart w:id="30" w:name="next-step"/>
     <w:p>
       <w:pPr>
         <w:pStyle w:val="Heading2"/>
@@ -594,9 +612,9 @@
         <w:t xml:space="preserve">vooee · vooee.au · jeanna@vooee.au</w:t>
       </w:r>
     </w:p>
-    <w:bookmarkEnd w:id="29"/>
     <w:bookmarkEnd w:id="30"/>
-    <w:bookmarkStart w:id="31" w:name="cover-email-draft-outlook-to-jordan"/>
+    <w:bookmarkEnd w:id="31"/>
+    <w:bookmarkStart w:id="32" w:name="cover-email-draft-outlook-to-jordan"/>
     <w:p>
       <w:pPr>
         <w:pStyle w:val="Heading1"/>
@@ -670,8 +688,8 @@
         </w:pict>
       </w:r>
     </w:p>
-    <w:bookmarkEnd w:id="31"/>
-    <w:bookmarkStart w:id="32" w:name="Xc12716d598599d4edaaba5230ff7f43746fb882"/>
+    <w:bookmarkEnd w:id="32"/>
+    <w:bookmarkStart w:id="33" w:name="Xc12716d598599d4edaaba5230ff7f43746fb882"/>
     <w:p>
       <w:pPr>
         <w:pStyle w:val="Heading1"/>
@@ -689,7 +707,7 @@
         <w:pStyle w:val="Compact"/>
       </w:pPr>
       <w:r>
-        <w:t xml:space="preserve">[J] Confirm sprint list price ($15,000 + GST) and the combined figure.</w:t>
+        <w:t xml:space="preserve">[J] Sprint priced at $18,000 + GST per Jeanna (22 Jul); combined $19,900 + GST. Note: the Travel Associates one-pager used $15,000 for a team-of-five sprint; align the two before both proposals are in market, or be ready to explain the difference.</w:t>
       </w:r>
     </w:p>
     <w:p>
@@ -752,7 +770,7 @@
         <w:t xml:space="preserve">Proposal date and the 14-day validity line updated to the actual send date.</w:t>
       </w:r>
     </w:p>
-    <w:bookmarkEnd w:id="32"/>
+    <w:bookmarkEnd w:id="33"/>
     <w:sectPr/>
   </w:body>
 </w:document>

</xml_diff>

<commit_message>
Close pricing flag: TA quote was circa and bespoke, 18k FEG price confirmed
Co-Authored-By: Claude Fable 5 <noreply@anthropic.com>
Claude-Session: https://claude.ai/code/session_01PPCVtAbEtcwFeYVLmMaxYT
</commit_message>
<xml_diff>
--- a/section-ai-alignment/word/10 AIPT proposal - DRAFT.docx
+++ b/section-ai-alignment/word/10 AIPT proposal - DRAFT.docx
@@ -707,7 +707,25 @@
         <w:pStyle w:val="Compact"/>
       </w:pPr>
       <w:r>
-        <w:t xml:space="preserve">[J] Sprint priced at $18,000 + GST per Jeanna (22 Jul); combined $19,900 + GST. Note: the Travel Associates one-pager used $15,000 for a team-of-five sprint; align the two before both proposals are in market, or be ready to explain the difference.</w:t>
+        <w:t xml:space="preserve">Pricing confirmed by Jeanna 22 Jul: sprint $18,000 + GST, combined $19,900 + GST. No conflict with Travel Associates: Sue was quoted</w:t>
+      </w:r>
+      <w:r>
+        <w:t xml:space="preserve"> </w:t>
+      </w:r>
+      <w:r>
+        <w:t xml:space="preserve">“</w:t>
+      </w:r>
+      <w:r>
+        <w:t xml:space="preserve">circa $15k</w:t>
+      </w:r>
+      <w:r>
+        <w:t xml:space="preserve">”</w:t>
+      </w:r>
+      <w:r>
+        <w:t xml:space="preserve"> </w:t>
+      </w:r>
+      <w:r>
+        <w:t xml:space="preserve">verbally with a bespoke proposal to follow, so both prices are deliberate and defensible.</w:t>
       </w:r>
     </w:p>
     <w:p>

</xml_diff>

<commit_message>
Add fourth theme to AIPT proposal: leadership appetite to understand, no existing governance
Co-Authored-By: Claude Fable 5 <noreply@anthropic.com>
Claude-Session: https://claude.ai/code/session_01PPCVtAbEtcwFeYVLmMaxYT
</commit_message>
<xml_diff>
--- a/section-ai-alignment/word/10 AIPT proposal - DRAFT.docx
+++ b/section-ai-alignment/word/10 AIPT proposal - DRAFT.docx
@@ -81,7 +81,7 @@
         <w:pStyle w:val="FirstParagraph"/>
       </w:pPr>
       <w:r>
-        <w:t xml:space="preserve">Three things stayed with me from Tuesday’s session with Lou, Ron, Shane and yourself.</w:t>
+        <w:t xml:space="preserve">Four things stayed with me from Tuesday’s session with Lou, Ron, Shane and yourself.</w:t>
       </w:r>
     </w:p>
     <w:p>
@@ -113,7 +113,15 @@
         <w:pStyle w:val="BodyText"/>
       </w:pPr>
       <w:r>
-        <w:t xml:space="preserve">This proposal covers all three, in order.</w:t>
+        <w:t xml:space="preserve">Fourth, and it might be the biggest: your leadership team wants to understand this properly, and right now there is nothing underneath the enthusiasm. No agreed position on what AI is for at FEG, no ground rules on what the tools may and may not touch. That is completely normal at this stage, and it is also the thing to fix first, because every other decision gets easier once it exists.</w:t>
+      </w:r>
+    </w:p>
+    <w:p>
+      <w:pPr>
+        <w:pStyle w:val="BodyText"/>
+      </w:pPr>
+      <w:r>
+        <w:t xml:space="preserve">This proposal covers all four, in order.</w:t>
       </w:r>
     </w:p>
     <w:bookmarkEnd w:id="21"/>

</xml_diff>

<commit_message>
Restructure proposal themes: two themes mapped to two parts, soften mechanics language
Co-Authored-By: Claude Fable 5 <noreply@anthropic.com>
Claude-Session: https://claude.ai/code/session_01PPCVtAbEtcwFeYVLmMaxYT
</commit_message>
<xml_diff>
--- a/section-ai-alignment/word/10 AIPT proposal - DRAFT.docx
+++ b/section-ai-alignment/word/10 AIPT proposal - DRAFT.docx
@@ -81,7 +81,7 @@
         <w:pStyle w:val="FirstParagraph"/>
       </w:pPr>
       <w:r>
-        <w:t xml:space="preserve">Four things stayed with me from Tuesday’s session with Lou, Ron, Shane and yourself.</w:t>
+        <w:t xml:space="preserve">Two themes ran through the session with Lou, Ron, Shane and yourself, and each one points at a specific piece of work.</w:t>
       </w:r>
     </w:p>
     <w:p>
@@ -89,7 +89,7 @@
         <w:pStyle w:val="BodyText"/>
       </w:pPr>
       <w:r>
-        <w:t xml:space="preserve">First, the appetite is real and it is immediate. You want Claude working in sales and marketing now, without waiting for the HubSpot migration or the new websites to land.</w:t>
+        <w:t xml:space="preserve">The first is about direction. Your leadership team is curious about what AI can do for FEG and wants to understand it properly, and the room’s own discussion showed the question that comes with that: sales and marketing first, but where do the student journey, events and operations fit, and when? Questions like that are best answered once, together, with an agreed position and a set of ground rules to work from. That is part one of this proposal.</w:t>
       </w:r>
     </w:p>
     <w:p>
@@ -97,31 +97,7 @@
         <w:pStyle w:val="BodyText"/>
       </w:pPr>
       <w:r>
-        <w:t xml:space="preserve">Second, you were clear about the destination: a team that builds and runs this work itself. Not a dependency on me, and not a dashboard that decays the day I stop maintaining it.</w:t>
-      </w:r>
-    </w:p>
-    <w:p>
-      <w:pPr>
-        <w:pStyle w:val="BodyText"/>
-      </w:pPr>
-      <w:r>
-        <w:t xml:space="preserve">Third, the room raised a question that deserves a proper answer: sales and marketing first, but where do the student journey, events and operations fit, and when? That is a leadership question, and there is a good way to answer it properly rather than by default.</w:t>
-      </w:r>
-    </w:p>
-    <w:p>
-      <w:pPr>
-        <w:pStyle w:val="BodyText"/>
-      </w:pPr>
-      <w:r>
-        <w:t xml:space="preserve">Fourth, and it might be the biggest: your leadership team wants to understand this properly, and right now there is nothing underneath the enthusiasm. No agreed position on what AI is for at FEG, no ground rules on what the tools may and may not touch. That is completely normal at this stage, and it is also the thing to fix first, because every other decision gets easier once it exists.</w:t>
-      </w:r>
-    </w:p>
-    <w:p>
-      <w:pPr>
-        <w:pStyle w:val="BodyText"/>
-      </w:pPr>
-      <w:r>
-        <w:t xml:space="preserve">This proposal covers all four, in order.</w:t>
+        <w:t xml:space="preserve">The second is about momentum. You want Claude working in sales and marketing now, without waiting for the HubSpot migration or the new websites, and you were clear about the destination: a team that builds and runs this work itself. Not a dependency on me, and not a dashboard that decays the day I stop maintaining it. That is part two.</w:t>
       </w:r>
     </w:p>
     <w:bookmarkEnd w:id="21"/>
@@ -156,15 +132,7 @@
         <w:pStyle w:val="FirstParagraph"/>
       </w:pPr>
       <w:r>
-        <w:t xml:space="preserve">A working session with a difference. Your leaders each answer the same questions independently, on their own devices, in the room: what AI is for at Foundation Education and AIPT, what worries them, which decisions should always stay with a person, and where the effort goes first. Then the answers go up on the screen, side by side.</w:t>
-      </w:r>
-    </w:p>
-    <w:p>
-      <w:pPr>
-        <w:pStyle w:val="BodyText"/>
-      </w:pPr>
-      <w:r>
-        <w:t xml:space="preserve">Where the team already agrees, we move fast. Where views differ, and they will, we sort it out in the room while it is cheap to do so.</w:t>
+        <w:t xml:space="preserve">A working session with your leadership team. We’ll surface how each of you thinks AI might be applied at FEG, the optimistic and the pessimistic, find where alignment already exists, and identify the areas of tension worth resolving while it is cheap to do so.</w:t>
       </w:r>
       <w:r>
         <w:t xml:space="preserve"> </w:t>

</xml_diff>

<commit_message>
Widen proposal beyond dashboards: call transcription and voice practice agents included
Co-Authored-By: Claude Fable 5 <noreply@anthropic.com>
Claude-Session: https://claude.ai/code/session_01PPCVtAbEtcwFeYVLmMaxYT
</commit_message>
<xml_diff>
--- a/section-ai-alignment/word/10 AIPT proposal - DRAFT.docx
+++ b/section-ai-alignment/word/10 AIPT proposal - DRAFT.docx
@@ -97,7 +97,7 @@
         <w:pStyle w:val="BodyText"/>
       </w:pPr>
       <w:r>
-        <w:t xml:space="preserve">The second is about momentum. You want Claude working in sales and marketing now, without waiting for the HubSpot migration or the new websites, and you were clear about the destination: a team that builds and runs this work itself. Not a dependency on me, and not a dashboard that decays the day I stop maintaining it. That is part two.</w:t>
+        <w:t xml:space="preserve">The second is about momentum. You want Claude working in sales and marketing now, without waiting for the HubSpot migration or the new websites. And the appetite went well beyond the dashboards: the training-call transcription work and the voice agents, onboarding new sales reps and practising objection handling, clearly struck a chord. You were also clear about the destination: a team that builds and runs this work itself. Not a dependency on me, and not tools that decay the day I stop maintaining them. That is part two.</w:t>
       </w:r>
     </w:p>
     <w:bookmarkEnd w:id="21"/>
@@ -262,7 +262,7 @@
         <w:t xml:space="preserve"> </w:t>
       </w:r>
       <w:r>
-        <w:t xml:space="preserve">Each person locks a real project from their own role. The obvious candidates are the ones we looked at on Tuesday: the social intelligence dashboards, the content engine, the nurture emails.</w:t>
+        <w:t xml:space="preserve">Each person locks a real project from their own role. The obvious candidates are the ones we looked at on Tuesday: the social intelligence dashboards, the content engine, the nurture emails, the training-call transcription and coaching work, and the voice practice tools for onboarding and objection handling.</w:t>
       </w:r>
     </w:p>
     <w:p>
@@ -341,13 +341,13 @@
     </w:p>
     <w:bookmarkEnd w:id="23"/>
     <w:bookmarkEnd w:id="24"/>
-    <w:bookmarkStart w:id="25" w:name="where-the-dashboards-fit"/>
+    <w:bookmarkStart w:id="25" w:name="where-the-working-examples-fit"/>
     <w:p>
       <w:pPr>
         <w:pStyle w:val="Heading2"/>
       </w:pPr>
       <w:r>
-        <w:t xml:space="preserve">Where the dashboards fit</w:t>
+        <w:t xml:space="preserve">Where the working examples fit</w:t>
       </w:r>
     </w:p>
     <w:p>
@@ -355,7 +355,7 @@
         <w:pStyle w:val="FirstParagraph"/>
       </w:pPr>
       <w:r>
-        <w:t xml:space="preserve">The social intelligence dashboards keep working as the live example throughout. During the sprint your team learns to maintain and extend them, so the asset and the capability land together. Further build work beyond that (the design agent, sentiment monitoring, deeper integrations) is scoped separately once the roadmap sets the order. [J: confirm this positioning, or fold a defined amount of build work into part two.]</w:t>
+        <w:t xml:space="preserve">The social intelligence dashboards, the call transcription work and the voice practice agents keep working as live examples throughout. During the sprint your team learns to run and extend what fits their roles, so the assets and the capability land together. Bigger builds (the design agent, sentiment monitoring, a production voice agent for rep onboarding and objection practice, deeper integrations) are scoped separately once the roadmap sets the order. [J: confirm this positioning, or fold a defined amount of build work into part two.]</w:t>
       </w:r>
     </w:p>
     <w:bookmarkEnd w:id="25"/>

</xml_diff>

<commit_message>
Add travel and accommodation as additional at-cost line to Investment
Co-Authored-By: Claude Fable 5 <noreply@anthropic.com>
Claude-Session: https://claude.ai/code/session_01PPCVtAbEtcwFeYVLmMaxYT
</commit_message>
<xml_diff>
--- a/section-ai-alignment/word/10 AIPT proposal - DRAFT.docx
+++ b/section-ai-alignment/word/10 AIPT proposal - DRAFT.docx
@@ -471,7 +471,7 @@
         <w:pStyle w:val="BodyText"/>
       </w:pPr>
       <w:r>
-        <w:t xml:space="preserve">Both parts at list pricing. The sprint includes all preparation and session materials, three 1:1 coaching sessions per person, the leadership 1:1s, and the closing report. [J: Alignment Room in person in Brisbane is the recommendation; confirm how you want to handle travel, or run it on Teams.]</w:t>
+        <w:t xml:space="preserve">Both parts at list pricing. The sprint includes all preparation and session materials, three 1:1 coaching sessions per person, the leadership 1:1s, and the closing report. Travel and accommodation for in-person sessions in Brisbane are additional, billed at cost. The Alignment Room works best in person; the sprint’s coaching sessions run well online, so most of the program carries no travel at all.</w:t>
       </w:r>
     </w:p>
     <w:bookmarkEnd w:id="26"/>
@@ -713,7 +713,7 @@
         <w:pStyle w:val="Compact"/>
       </w:pPr>
       <w:r>
-        <w:t xml:space="preserve">[J] Travel or Teams for the Brisbane session; adjust the Investment note.</w:t>
+        <w:t xml:space="preserve">Travel settled (Jeanna, 22 Jul): in-person Brisbane recommended, travel and accommodation additional at cost; sprint coaching runs online.</w:t>
       </w:r>
     </w:p>
     <w:p>

</xml_diff>